<commit_message>
Refresh FIAKeyTerms data for 2026-10-28 release
</commit_message>
<xml_diff>
--- a/eng/docx/002.content.docx
+++ b/eng/docx/002.content.docx
@@ -405,48 +405,72 @@
         </w:rPr>
         <w:t xml:space="preserve">The word has a special religious meaning. In the Old Testament, </w:t>
       </w:r>
-      <w:r>
-        <w:rPr>
-          <w:lang w:val="en_US" w:bidi="en_US"/>
-        </w:rPr>
-        <w:t>Jewish</w:t>
-      </w:r>
+      <w:hyperlink r:id="rId14">
+        <w:r>
+          <w:rPr>
+            <w:lang w:val="en_US" w:bidi="en_US"/>
+          </w:rPr>
+          <w:rPr>
+            <w:color w:val="0000EE"/>
+            <w:u w:val="single"/>
+          </w:rPr>
+          <w:t>Jewish</w:t>
+        </w:r>
+      </w:hyperlink>
       <w:r>
         <w:rPr>
           <w:lang w:val="en_US" w:bidi="en_US"/>
         </w:rPr>
         <w:t xml:space="preserve"> </w:t>
       </w:r>
-      <w:r>
-        <w:rPr>
-          <w:lang w:val="en_US" w:bidi="en_US"/>
-        </w:rPr>
-        <w:t>priests</w:t>
-      </w:r>
+      <w:hyperlink r:id="rId15">
+        <w:r>
+          <w:rPr>
+            <w:lang w:val="en_US" w:bidi="en_US"/>
+          </w:rPr>
+          <w:rPr>
+            <w:color w:val="0000EE"/>
+            <w:u w:val="single"/>
+          </w:rPr>
+          <w:t>priests</w:t>
+        </w:r>
+      </w:hyperlink>
       <w:r>
         <w:rPr>
           <w:lang w:val="en_US" w:bidi="en_US"/>
         </w:rPr>
         <w:t xml:space="preserve"> would baptize themselves before they would do their work in the </w:t>
       </w:r>
-      <w:r>
-        <w:rPr>
-          <w:lang w:val="en_US" w:bidi="en_US"/>
-        </w:rPr>
-        <w:t>temple</w:t>
-      </w:r>
+      <w:hyperlink r:id="rId16">
+        <w:r>
+          <w:rPr>
+            <w:lang w:val="en_US" w:bidi="en_US"/>
+          </w:rPr>
+          <w:rPr>
+            <w:color w:val="0000EE"/>
+            <w:u w:val="single"/>
+          </w:rPr>
+          <w:t>temple</w:t>
+        </w:r>
+      </w:hyperlink>
       <w:r>
         <w:rPr>
           <w:lang w:val="en_US" w:bidi="en_US"/>
         </w:rPr>
         <w:t xml:space="preserve"> of God. This made them "</w:t>
       </w:r>
-      <w:r>
-        <w:rPr>
-          <w:lang w:val="en_US" w:bidi="en_US"/>
-        </w:rPr>
-        <w:t>clean</w:t>
-      </w:r>
+      <w:hyperlink r:id="rId17">
+        <w:r>
+          <w:rPr>
+            <w:lang w:val="en_US" w:bidi="en_US"/>
+          </w:rPr>
+          <w:rPr>
+            <w:color w:val="0000EE"/>
+            <w:u w:val="single"/>
+          </w:rPr>
+          <w:t>clean</w:t>
+        </w:r>
+      </w:hyperlink>
       <w:r>
         <w:rPr>
           <w:lang w:val="en_US" w:bidi="en_US"/>
@@ -481,24 +505,36 @@
         </w:rPr>
         <w:t xml:space="preserve">When </w:t>
       </w:r>
-      <w:r>
-        <w:rPr>
-          <w:lang w:val="en_US" w:bidi="en_US"/>
-        </w:rPr>
-        <w:t>John the baptizer</w:t>
-      </w:r>
+      <w:hyperlink r:id="rId18">
+        <w:r>
+          <w:rPr>
+            <w:lang w:val="en_US" w:bidi="en_US"/>
+          </w:rPr>
+          <w:rPr>
+            <w:color w:val="0000EE"/>
+            <w:u w:val="single"/>
+          </w:rPr>
+          <w:t>John the baptizer</w:t>
+        </w:r>
+      </w:hyperlink>
       <w:r>
         <w:rPr>
           <w:lang w:val="en_US" w:bidi="en_US"/>
         </w:rPr>
         <w:t xml:space="preserve"> came, he did something new by telling all the people that they should take baptism. Being born as a Jew wasn't enough to be part of God's people! All people needed to </w:t>
       </w:r>
-      <w:r>
-        <w:rPr>
-          <w:lang w:val="en_US" w:bidi="en_US"/>
-        </w:rPr>
-        <w:t>repent</w:t>
-      </w:r>
+      <w:hyperlink r:id="rId19">
+        <w:r>
+          <w:rPr>
+            <w:lang w:val="en_US" w:bidi="en_US"/>
+          </w:rPr>
+          <w:rPr>
+            <w:color w:val="0000EE"/>
+            <w:u w:val="single"/>
+          </w:rPr>
+          <w:t>repent</w:t>
+        </w:r>
+      </w:hyperlink>
       <w:r>
         <w:rPr>
           <w:lang w:val="en_US" w:bidi="en_US"/>
@@ -519,48 +555,72 @@
         </w:rPr>
         <w:t xml:space="preserve">Just before Jesus went back to </w:t>
       </w:r>
-      <w:r>
-        <w:rPr>
-          <w:lang w:val="en_US" w:bidi="en_US"/>
-        </w:rPr>
-        <w:t>heaven</w:t>
-      </w:r>
+      <w:hyperlink r:id="rId20">
+        <w:r>
+          <w:rPr>
+            <w:lang w:val="en_US" w:bidi="en_US"/>
+          </w:rPr>
+          <w:rPr>
+            <w:color w:val="0000EE"/>
+            <w:u w:val="single"/>
+          </w:rPr>
+          <w:t>heaven</w:t>
+        </w:r>
+      </w:hyperlink>
       <w:r>
         <w:rPr>
           <w:lang w:val="en_US" w:bidi="en_US"/>
         </w:rPr>
         <w:t xml:space="preserve">, he told his </w:t>
       </w:r>
-      <w:r>
-        <w:rPr>
-          <w:lang w:val="en_US" w:bidi="en_US"/>
-        </w:rPr>
-        <w:t>disciples</w:t>
-      </w:r>
+      <w:hyperlink r:id="rId21">
+        <w:r>
+          <w:rPr>
+            <w:lang w:val="en_US" w:bidi="en_US"/>
+          </w:rPr>
+          <w:rPr>
+            <w:color w:val="0000EE"/>
+            <w:u w:val="single"/>
+          </w:rPr>
+          <w:t>disciples</w:t>
+        </w:r>
+      </w:hyperlink>
       <w:r>
         <w:rPr>
           <w:lang w:val="en_US" w:bidi="en_US"/>
         </w:rPr>
         <w:t xml:space="preserve"> to go and tell people everywhere that Jesus has all </w:t>
       </w:r>
-      <w:r>
-        <w:rPr>
-          <w:lang w:val="en_US" w:bidi="en_US"/>
-        </w:rPr>
-        <w:t>authority</w:t>
-      </w:r>
+      <w:hyperlink r:id="rId22">
+        <w:r>
+          <w:rPr>
+            <w:lang w:val="en_US" w:bidi="en_US"/>
+          </w:rPr>
+          <w:rPr>
+            <w:color w:val="0000EE"/>
+            <w:u w:val="single"/>
+          </w:rPr>
+          <w:t>authority</w:t>
+        </w:r>
+      </w:hyperlink>
       <w:r>
         <w:rPr>
           <w:lang w:val="en_US" w:bidi="en_US"/>
         </w:rPr>
         <w:t xml:space="preserve">. Jesus told them to make all people Jesus's disciples, and to baptize them in the name of the father, the son, and the </w:t>
       </w:r>
-      <w:r>
-        <w:rPr>
-          <w:lang w:val="en_US" w:bidi="en_US"/>
-        </w:rPr>
-        <w:t>Holy Spirit</w:t>
-      </w:r>
+      <w:hyperlink r:id="rId23">
+        <w:r>
+          <w:rPr>
+            <w:lang w:val="en_US" w:bidi="en_US"/>
+          </w:rPr>
+          <w:rPr>
+            <w:color w:val="0000EE"/>
+            <w:u w:val="single"/>
+          </w:rPr>
+          <w:t>Holy Spirit</w:t>
+        </w:r>
+      </w:hyperlink>
       <w:r>
         <w:rPr>
           <w:lang w:val="en_US" w:bidi="en_US"/>
@@ -581,24 +641,36 @@
         </w:rPr>
         <w:t xml:space="preserve">And so, from that time onwards, we see that as soon as people began to </w:t>
       </w:r>
-      <w:r>
-        <w:rPr>
-          <w:lang w:val="en_US" w:bidi="en_US"/>
-        </w:rPr>
-        <w:t>believe</w:t>
-      </w:r>
+      <w:hyperlink r:id="rId24">
+        <w:r>
+          <w:rPr>
+            <w:lang w:val="en_US" w:bidi="en_US"/>
+          </w:rPr>
+          <w:rPr>
+            <w:color w:val="0000EE"/>
+            <w:u w:val="single"/>
+          </w:rPr>
+          <w:t>believe</w:t>
+        </w:r>
+      </w:hyperlink>
       <w:r>
         <w:rPr>
           <w:lang w:val="en_US" w:bidi="en_US"/>
         </w:rPr>
         <w:t xml:space="preserve"> in Jesus they took baptism. This baptism was a sign of their repentance and need for </w:t>
       </w:r>
-      <w:r>
-        <w:rPr>
-          <w:lang w:val="en_US" w:bidi="en_US"/>
-        </w:rPr>
-        <w:t>forgiveness</w:t>
-      </w:r>
+      <w:hyperlink r:id="rId25">
+        <w:r>
+          <w:rPr>
+            <w:lang w:val="en_US" w:bidi="en_US"/>
+          </w:rPr>
+          <w:rPr>
+            <w:color w:val="0000EE"/>
+            <w:u w:val="single"/>
+          </w:rPr>
+          <w:t>forgiveness</w:t>
+        </w:r>
+      </w:hyperlink>
       <w:r>
         <w:rPr>
           <w:lang w:val="en_US" w:bidi="en_US"/>
@@ -619,12 +691,18 @@
         </w:rPr>
         <w:t xml:space="preserve">Paul, in his letters, explains that when we take baptism it is as if we die and become alive again. We die by going under in the water, and become alive again by coming up out of the water. This is a symbol showing that our old life is dead. We now have a new life because we belong to Jesus. Jesus died for us, and became alive again. When we take baptism, we accept that Jesus died in our place, and that we are new people because God has forgiven us. Just as water cleanses our bodies from dirt, Jesus has "cleansed" us from our </w:t>
       </w:r>
-      <w:r>
-        <w:rPr>
-          <w:lang w:val="en_US" w:bidi="en_US"/>
-        </w:rPr>
-        <w:t>sins</w:t>
-      </w:r>
+      <w:hyperlink r:id="rId26">
+        <w:r>
+          <w:rPr>
+            <w:lang w:val="en_US" w:bidi="en_US"/>
+          </w:rPr>
+          <w:rPr>
+            <w:color w:val="0000EE"/>
+            <w:u w:val="single"/>
+          </w:rPr>
+          <w:t>sins</w:t>
+        </w:r>
+      </w:hyperlink>
       <w:r>
         <w:rPr>
           <w:lang w:val="en_US" w:bidi="en_US"/>
@@ -674,24 +752,36 @@
         </w:rPr>
         <w:t xml:space="preserve">The word baptism, and to baptize someone, can be difficult to translate. Many people use a word that sounds like the </w:t>
       </w:r>
-      <w:r>
-        <w:rPr>
-          <w:lang w:val="en_US" w:bidi="en_US"/>
-        </w:rPr>
-        <w:t>Greek</w:t>
-      </w:r>
+      <w:hyperlink r:id="rId27">
+        <w:r>
+          <w:rPr>
+            <w:lang w:val="en_US" w:bidi="en_US"/>
+          </w:rPr>
+          <w:rPr>
+            <w:color w:val="0000EE"/>
+            <w:u w:val="single"/>
+          </w:rPr>
+          <w:t>Greek</w:t>
+        </w:r>
+      </w:hyperlink>
       <w:r>
         <w:rPr>
           <w:lang w:val="en_US" w:bidi="en_US"/>
         </w:rPr>
         <w:t xml:space="preserve"> word "baptizo." New </w:t>
       </w:r>
-      <w:r>
-        <w:rPr>
-          <w:lang w:val="en_US" w:bidi="en_US"/>
-        </w:rPr>
-        <w:t>believers</w:t>
-      </w:r>
+      <w:hyperlink r:id="rId28">
+        <w:r>
+          <w:rPr>
+            <w:lang w:val="en_US" w:bidi="en_US"/>
+          </w:rPr>
+          <w:rPr>
+            <w:color w:val="0000EE"/>
+            <w:u w:val="single"/>
+          </w:rPr>
+          <w:t>believers</w:t>
+        </w:r>
+      </w:hyperlink>
       <w:r>
         <w:rPr>
           <w:lang w:val="en_US" w:bidi="en_US"/>
@@ -770,7 +860,7 @@
           <w:lang w:val="en_US" w:bidi="en_US"/>
         </w:rPr>
       </w:r>
-      <w:hyperlink r:id="rId14">
+      <w:hyperlink r:id="rId29">
         <w:r>
           <w:rPr>
             <w:lang w:val="en_US" w:bidi="en_US"/>
@@ -921,7 +1011,7 @@
           <w:lang w:val="en_US" w:bidi="en_US"/>
         </w:rPr>
       </w:r>
-      <w:hyperlink r:id="rId15">
+      <w:hyperlink r:id="rId30">
         <w:r>
           <w:rPr>
             <w:lang w:val="en_US" w:bidi="en_US"/>
@@ -994,12 +1084,18 @@
         </w:rPr>
         <w:t xml:space="preserve"> and to have </w:t>
       </w:r>
-      <w:r>
-        <w:rPr>
-          <w:lang w:val="en_US" w:bidi="en_US"/>
-        </w:rPr>
-        <w:t>faith</w:t>
-      </w:r>
+      <w:hyperlink r:id="rId31">
+        <w:r>
+          <w:rPr>
+            <w:lang w:val="en_US" w:bidi="en_US"/>
+          </w:rPr>
+          <w:rPr>
+            <w:color w:val="0000EE"/>
+            <w:u w:val="single"/>
+          </w:rPr>
+          <w:t>faith</w:t>
+        </w:r>
+      </w:hyperlink>
       <w:r>
         <w:rPr>
           <w:lang w:val="en_US" w:bidi="en_US"/>
@@ -1028,24 +1124,36 @@
           <w:lang w:val="en_US" w:bidi="en_US"/>
         </w:rPr>
       </w:r>
-      <w:r>
-        <w:rPr>
-          <w:lang w:val="en_US" w:bidi="en_US"/>
-        </w:rPr>
-        <w:t>Abraham</w:t>
-      </w:r>
+      <w:hyperlink r:id="rId32">
+        <w:r>
+          <w:rPr>
+            <w:lang w:val="en_US" w:bidi="en_US"/>
+          </w:rPr>
+          <w:rPr>
+            <w:color w:val="0000EE"/>
+            <w:u w:val="single"/>
+          </w:rPr>
+          <w:t>Abraham</w:t>
+        </w:r>
+      </w:hyperlink>
       <w:r>
         <w:rPr>
           <w:lang w:val="en_US" w:bidi="en_US"/>
         </w:rPr>
         <w:t xml:space="preserve"> believed that God spoke the truth when he promised that Abraham would have many </w:t>
       </w:r>
-      <w:r>
-        <w:rPr>
-          <w:lang w:val="en_US" w:bidi="en_US"/>
-        </w:rPr>
-        <w:t>descendants</w:t>
-      </w:r>
+      <w:hyperlink r:id="rId33">
+        <w:r>
+          <w:rPr>
+            <w:lang w:val="en_US" w:bidi="en_US"/>
+          </w:rPr>
+          <w:rPr>
+            <w:color w:val="0000EE"/>
+            <w:u w:val="single"/>
+          </w:rPr>
+          <w:t>descendants</w:t>
+        </w:r>
+      </w:hyperlink>
       <w:r>
         <w:rPr>
           <w:lang w:val="en_US" w:bidi="en_US"/>
@@ -1080,36 +1188,54 @@
         </w:rPr>
         <w:t xml:space="preserve">When you believe in Jesus, you believe that Jesus is indeed the </w:t>
       </w:r>
-      <w:r>
-        <w:rPr>
-          <w:lang w:val="en_US" w:bidi="en_US"/>
-        </w:rPr>
-        <w:t>son of God</w:t>
-      </w:r>
+      <w:hyperlink r:id="rId34">
+        <w:r>
+          <w:rPr>
+            <w:lang w:val="en_US" w:bidi="en_US"/>
+          </w:rPr>
+          <w:rPr>
+            <w:color w:val="0000EE"/>
+            <w:u w:val="single"/>
+          </w:rPr>
+          <w:t>son of God</w:t>
+        </w:r>
+      </w:hyperlink>
       <w:r>
         <w:rPr>
           <w:lang w:val="en_US" w:bidi="en_US"/>
         </w:rPr>
         <w:t xml:space="preserve">. You trust that Jesus has indeed died for your </w:t>
       </w:r>
-      <w:r>
-        <w:rPr>
-          <w:lang w:val="en_US" w:bidi="en_US"/>
-        </w:rPr>
-        <w:t>sins</w:t>
-      </w:r>
+      <w:hyperlink r:id="rId26">
+        <w:r>
+          <w:rPr>
+            <w:lang w:val="en_US" w:bidi="en_US"/>
+          </w:rPr>
+          <w:rPr>
+            <w:color w:val="0000EE"/>
+            <w:u w:val="single"/>
+          </w:rPr>
+          <w:t>sins</w:t>
+        </w:r>
+      </w:hyperlink>
       <w:r>
         <w:rPr>
           <w:lang w:val="en_US" w:bidi="en_US"/>
         </w:rPr>
         <w:t xml:space="preserve">, and that God has </w:t>
       </w:r>
-      <w:r>
-        <w:rPr>
-          <w:lang w:val="en_US" w:bidi="en_US"/>
-        </w:rPr>
-        <w:t>forgiven</w:t>
-      </w:r>
+      <w:hyperlink r:id="rId25">
+        <w:r>
+          <w:rPr>
+            <w:lang w:val="en_US" w:bidi="en_US"/>
+          </w:rPr>
+          <w:rPr>
+            <w:color w:val="0000EE"/>
+            <w:u w:val="single"/>
+          </w:rPr>
+          <w:t>forgiven</w:t>
+        </w:r>
+      </w:hyperlink>
       <w:r>
         <w:rPr>
           <w:lang w:val="en_US" w:bidi="en_US"/>
@@ -1225,6 +1351,12 @@
         <w:rPr>
           <w:lang w:val="en_US" w:bidi="en_US"/>
         </w:rPr>
+        <w:t>Pause the recording here.</w:t>
+      </w:r>
+      <w:r>
+        <w:rPr>
+          <w:lang w:val="en_US" w:bidi="en_US"/>
+        </w:rPr>
       </w:r>
       <w:r>
         <w:rPr>
@@ -1279,7 +1411,7 @@
           <w:lang w:val="en_US" w:bidi="en_US"/>
         </w:rPr>
       </w:r>
-      <w:hyperlink r:id="rId16">
+      <w:hyperlink r:id="rId35">
         <w:r>
           <w:rPr>
             <w:lang w:val="en_US" w:bidi="en_US"/>
@@ -1358,24 +1490,36 @@
         </w:rPr>
         <w:t xml:space="preserve">. A believer is a person who has chosen to believe the </w:t>
       </w:r>
-      <w:r>
-        <w:rPr>
-          <w:lang w:val="en_US" w:bidi="en_US"/>
-        </w:rPr>
-        <w:t>good news</w:t>
-      </w:r>
+      <w:hyperlink r:id="rId36">
+        <w:r>
+          <w:rPr>
+            <w:lang w:val="en_US" w:bidi="en_US"/>
+          </w:rPr>
+          <w:rPr>
+            <w:color w:val="0000EE"/>
+            <w:u w:val="single"/>
+          </w:rPr>
+          <w:t>good news</w:t>
+        </w:r>
+      </w:hyperlink>
       <w:r>
         <w:rPr>
           <w:lang w:val="en_US" w:bidi="en_US"/>
         </w:rPr>
         <w:t xml:space="preserve"> about Jesus and to trust in Jesus and follow him as their </w:t>
       </w:r>
-      <w:r>
-        <w:rPr>
-          <w:lang w:val="en_US" w:bidi="en_US"/>
-        </w:rPr>
-        <w:t>Lord</w:t>
-      </w:r>
+      <w:hyperlink r:id="rId37">
+        <w:r>
+          <w:rPr>
+            <w:lang w:val="en_US" w:bidi="en_US"/>
+          </w:rPr>
+          <w:rPr>
+            <w:color w:val="0000EE"/>
+            <w:u w:val="single"/>
+          </w:rPr>
+          <w:t>Lord</w:t>
+        </w:r>
+      </w:hyperlink>
       <w:r>
         <w:rPr>
           <w:lang w:val="en_US" w:bidi="en_US"/>
@@ -1440,7 +1584,7 @@
           <w:lang w:val="en_US" w:bidi="en_US"/>
         </w:rPr>
       </w:r>
-      <w:hyperlink r:id="rId17">
+      <w:hyperlink r:id="rId38">
         <w:r>
           <w:rPr>
             <w:lang w:val="en_US" w:bidi="en_US"/>
@@ -1527,36 +1671,54 @@
         </w:rPr>
         <w:t xml:space="preserve">Bethlehem was a small village in </w:t>
       </w:r>
-      <w:r>
-        <w:rPr>
-          <w:lang w:val="en_US" w:bidi="en_US"/>
-        </w:rPr>
-        <w:t>Israel</w:t>
-      </w:r>
+      <w:hyperlink r:id="rId39">
+        <w:r>
+          <w:rPr>
+            <w:lang w:val="en_US" w:bidi="en_US"/>
+          </w:rPr>
+          <w:rPr>
+            <w:color w:val="0000EE"/>
+            <w:u w:val="single"/>
+          </w:rPr>
+          <w:t>Israel</w:t>
+        </w:r>
+      </w:hyperlink>
       <w:r>
         <w:rPr>
           <w:lang w:val="en_US" w:bidi="en_US"/>
         </w:rPr>
         <w:t xml:space="preserve">. The name Bethlehem means "house of bread." In the Old Testament, the events in the book of Ruth took place in Bethlehem. Ruth was a Moabite woman, so she was not an </w:t>
       </w:r>
-      <w:r>
-        <w:rPr>
-          <w:lang w:val="en_US" w:bidi="en_US"/>
-        </w:rPr>
-        <w:t>Israelite</w:t>
-      </w:r>
+      <w:hyperlink r:id="rId40">
+        <w:r>
+          <w:rPr>
+            <w:lang w:val="en_US" w:bidi="en_US"/>
+          </w:rPr>
+          <w:rPr>
+            <w:color w:val="0000EE"/>
+            <w:u w:val="single"/>
+          </w:rPr>
+          <w:t>Israelite</w:t>
+        </w:r>
+      </w:hyperlink>
       <w:r>
         <w:rPr>
           <w:lang w:val="en_US" w:bidi="en_US"/>
         </w:rPr>
         <w:t xml:space="preserve">. Ruth's first husband had died, so Ruth came to live in Bethlehem with her Israelite mother-in-law. Later, Ruth married an Israelite man from Bethlehem. The great grandson of Ruth and her Israelite husband was </w:t>
       </w:r>
-      <w:r>
-        <w:rPr>
-          <w:lang w:val="en_US" w:bidi="en_US"/>
-        </w:rPr>
-        <w:t>David</w:t>
-      </w:r>
+      <w:hyperlink r:id="rId41">
+        <w:r>
+          <w:rPr>
+            <w:lang w:val="en_US" w:bidi="en_US"/>
+          </w:rPr>
+          <w:rPr>
+            <w:color w:val="0000EE"/>
+            <w:u w:val="single"/>
+          </w:rPr>
+          <w:t>David</w:t>
+        </w:r>
+      </w:hyperlink>
       <w:r>
         <w:rPr>
           <w:lang w:val="en_US" w:bidi="en_US"/>
@@ -1591,48 +1753,72 @@
         </w:rPr>
         <w:t xml:space="preserve">God later said through the </w:t>
       </w:r>
-      <w:r>
-        <w:rPr>
-          <w:lang w:val="en_US" w:bidi="en_US"/>
-        </w:rPr>
-        <w:t>prophet</w:t>
-      </w:r>
+      <w:hyperlink r:id="rId42">
+        <w:r>
+          <w:rPr>
+            <w:lang w:val="en_US" w:bidi="en_US"/>
+          </w:rPr>
+          <w:rPr>
+            <w:color w:val="0000EE"/>
+            <w:u w:val="single"/>
+          </w:rPr>
+          <w:t>prophet</w:t>
+        </w:r>
+      </w:hyperlink>
       <w:r>
         <w:rPr>
           <w:lang w:val="en_US" w:bidi="en_US"/>
         </w:rPr>
         <w:t xml:space="preserve"> Micah that another very important ruler would be born in Bethlehem. Therefore the </w:t>
       </w:r>
-      <w:r>
-        <w:rPr>
-          <w:lang w:val="en_US" w:bidi="en_US"/>
-        </w:rPr>
-        <w:t>Jews</w:t>
-      </w:r>
+      <w:hyperlink r:id="rId14">
+        <w:r>
+          <w:rPr>
+            <w:lang w:val="en_US" w:bidi="en_US"/>
+          </w:rPr>
+          <w:rPr>
+            <w:color w:val="0000EE"/>
+            <w:u w:val="single"/>
+          </w:rPr>
+          <w:t>Jews</w:t>
+        </w:r>
+      </w:hyperlink>
       <w:r>
         <w:rPr>
           <w:lang w:val="en_US" w:bidi="en_US"/>
         </w:rPr>
         <w:t xml:space="preserve"> were expecting that the </w:t>
       </w:r>
-      <w:r>
-        <w:rPr>
-          <w:lang w:val="en_US" w:bidi="en_US"/>
-        </w:rPr>
-        <w:t>Messiah</w:t>
-      </w:r>
+      <w:hyperlink r:id="rId43">
+        <w:r>
+          <w:rPr>
+            <w:lang w:val="en_US" w:bidi="en_US"/>
+          </w:rPr>
+          <w:rPr>
+            <w:color w:val="0000EE"/>
+            <w:u w:val="single"/>
+          </w:rPr>
+          <w:t>Messiah</w:t>
+        </w:r>
+      </w:hyperlink>
       <w:r>
         <w:rPr>
           <w:lang w:val="en_US" w:bidi="en_US"/>
         </w:rPr>
         <w:t xml:space="preserve">, the special King and </w:t>
       </w:r>
-      <w:r>
-        <w:rPr>
-          <w:lang w:val="en_US" w:bidi="en_US"/>
-        </w:rPr>
-        <w:t>Savior</w:t>
-      </w:r>
+      <w:hyperlink r:id="rId44">
+        <w:r>
+          <w:rPr>
+            <w:lang w:val="en_US" w:bidi="en_US"/>
+          </w:rPr>
+          <w:rPr>
+            <w:color w:val="0000EE"/>
+            <w:u w:val="single"/>
+          </w:rPr>
+          <w:t>Savior</w:t>
+        </w:r>
+      </w:hyperlink>
       <w:r>
         <w:rPr>
           <w:lang w:val="en_US" w:bidi="en_US"/>
@@ -1667,12 +1853,18 @@
         </w:rPr>
         <w:t xml:space="preserve">Bethlehem was a few kilometers away from </w:t>
       </w:r>
-      <w:r>
-        <w:rPr>
-          <w:lang w:val="en_US" w:bidi="en_US"/>
-        </w:rPr>
-        <w:t>Jerusalem</w:t>
-      </w:r>
+      <w:hyperlink r:id="rId45">
+        <w:r>
+          <w:rPr>
+            <w:lang w:val="en_US" w:bidi="en_US"/>
+          </w:rPr>
+          <w:rPr>
+            <w:color w:val="0000EE"/>
+            <w:u w:val="single"/>
+          </w:rPr>
+          <w:t>Jerusalem</w:t>
+        </w:r>
+      </w:hyperlink>
       <w:r>
         <w:rPr>
           <w:lang w:val="en_US" w:bidi="en_US"/>
@@ -1737,7 +1929,7 @@
           <w:lang w:val="en_US" w:bidi="en_US"/>
         </w:rPr>
       </w:r>
-      <w:hyperlink r:id="rId18">
+      <w:hyperlink r:id="rId46">
         <w:r>
           <w:rPr>
             <w:lang w:val="en_US" w:bidi="en_US"/>
@@ -1810,60 +2002,90 @@
         </w:rPr>
         <w:t xml:space="preserve"> is a village in the province of </w:t>
       </w:r>
-      <w:r>
-        <w:rPr>
-          <w:lang w:val="en_US" w:bidi="en_US"/>
-        </w:rPr>
-        <w:t>Galilee</w:t>
-      </w:r>
+      <w:hyperlink r:id="rId47">
+        <w:r>
+          <w:rPr>
+            <w:lang w:val="en_US" w:bidi="en_US"/>
+          </w:rPr>
+          <w:rPr>
+            <w:color w:val="0000EE"/>
+            <w:u w:val="single"/>
+          </w:rPr>
+          <w:t>Galilee</w:t>
+        </w:r>
+      </w:hyperlink>
       <w:r>
         <w:rPr>
           <w:lang w:val="en_US" w:bidi="en_US"/>
         </w:rPr>
         <w:t xml:space="preserve">. It was probably close to the city of </w:t>
       </w:r>
-      <w:r>
-        <w:rPr>
-          <w:lang w:val="en_US" w:bidi="en_US"/>
-        </w:rPr>
-        <w:t>Capernaum</w:t>
-      </w:r>
+      <w:hyperlink r:id="rId48">
+        <w:r>
+          <w:rPr>
+            <w:lang w:val="en_US" w:bidi="en_US"/>
+          </w:rPr>
+          <w:rPr>
+            <w:color w:val="0000EE"/>
+            <w:u w:val="single"/>
+          </w:rPr>
+          <w:t>Capernaum</w:t>
+        </w:r>
+      </w:hyperlink>
       <w:r>
         <w:rPr>
           <w:lang w:val="en_US" w:bidi="en_US"/>
         </w:rPr>
         <w:t xml:space="preserve">, because </w:t>
       </w:r>
-      <w:r>
-        <w:rPr>
-          <w:lang w:val="en_US" w:bidi="en_US"/>
-        </w:rPr>
-        <w:t>John</w:t>
-      </w:r>
+      <w:hyperlink r:id="rId49">
+        <w:r>
+          <w:rPr>
+            <w:lang w:val="en_US" w:bidi="en_US"/>
+          </w:rPr>
+          <w:rPr>
+            <w:color w:val="0000EE"/>
+            <w:u w:val="single"/>
+          </w:rPr>
+          <w:t>John</w:t>
+        </w:r>
+      </w:hyperlink>
       <w:r>
         <w:rPr>
           <w:lang w:val="en_US" w:bidi="en_US"/>
         </w:rPr>
         <w:t xml:space="preserve"> tells us that Jesus's </w:t>
       </w:r>
-      <w:r>
-        <w:rPr>
-          <w:lang w:val="en_US" w:bidi="en_US"/>
-        </w:rPr>
-        <w:t>disciples</w:t>
-      </w:r>
+      <w:hyperlink r:id="rId21">
+        <w:r>
+          <w:rPr>
+            <w:lang w:val="en_US" w:bidi="en_US"/>
+          </w:rPr>
+          <w:rPr>
+            <w:color w:val="0000EE"/>
+            <w:u w:val="single"/>
+          </w:rPr>
+          <w:t>disciples</w:t>
+        </w:r>
+      </w:hyperlink>
       <w:r>
         <w:rPr>
           <w:lang w:val="en_US" w:bidi="en_US"/>
         </w:rPr>
         <w:t xml:space="preserve"> Andrew and Peter came from Bethsaida, but Mark tells us that they lived in Capernaum. The village was close to the </w:t>
       </w:r>
-      <w:r>
-        <w:rPr>
-          <w:lang w:val="en_US" w:bidi="en_US"/>
-        </w:rPr>
-        <w:t>Sea of Galilee</w:t>
-      </w:r>
+      <w:hyperlink r:id="rId50">
+        <w:r>
+          <w:rPr>
+            <w:lang w:val="en_US" w:bidi="en_US"/>
+          </w:rPr>
+          <w:rPr>
+            <w:color w:val="0000EE"/>
+            <w:u w:val="single"/>
+          </w:rPr>
+          <w:t>Sea of Galilee</w:t>
+        </w:r>
+      </w:hyperlink>
       <w:r>
         <w:rPr>
           <w:lang w:val="en_US" w:bidi="en_US"/>
@@ -1928,7 +2150,7 @@
           <w:lang w:val="en_US" w:bidi="en_US"/>
         </w:rPr>
       </w:r>
-      <w:hyperlink r:id="rId19">
+      <w:hyperlink r:id="rId51">
         <w:r>
           <w:rPr>
             <w:lang w:val="en_US" w:bidi="en_US"/>
@@ -2007,24 +2229,36 @@
         </w:rPr>
         <w:t xml:space="preserve"> someone means to speak </w:t>
       </w:r>
-      <w:r>
-        <w:rPr>
-          <w:lang w:val="en_US" w:bidi="en_US"/>
-        </w:rPr>
-        <w:t>evil</w:t>
-      </w:r>
+      <w:hyperlink r:id="rId52">
+        <w:r>
+          <w:rPr>
+            <w:lang w:val="en_US" w:bidi="en_US"/>
+          </w:rPr>
+          <w:rPr>
+            <w:color w:val="0000EE"/>
+            <w:u w:val="single"/>
+          </w:rPr>
+          <w:t>evil</w:t>
+        </w:r>
+      </w:hyperlink>
       <w:r>
         <w:rPr>
           <w:lang w:val="en_US" w:bidi="en_US"/>
         </w:rPr>
         <w:t xml:space="preserve"> about a person, and to insult someone. A person who </w:t>
       </w:r>
-      <w:r>
-        <w:rPr>
-          <w:lang w:val="en_US" w:bidi="en_US"/>
-        </w:rPr>
-        <w:t>curses</w:t>
-      </w:r>
+      <w:hyperlink r:id="rId53">
+        <w:r>
+          <w:rPr>
+            <w:lang w:val="en_US" w:bidi="en_US"/>
+          </w:rPr>
+          <w:rPr>
+            <w:color w:val="0000EE"/>
+            <w:u w:val="single"/>
+          </w:rPr>
+          <w:t>curses</w:t>
+        </w:r>
+      </w:hyperlink>
       <w:r>
         <w:rPr>
           <w:lang w:val="en_US" w:bidi="en_US"/>
@@ -2089,7 +2323,7 @@
           <w:lang w:val="en_US" w:bidi="en_US"/>
         </w:rPr>
       </w:r>
-      <w:hyperlink r:id="rId20">
+      <w:hyperlink r:id="rId54">
         <w:r>
           <w:rPr>
             <w:lang w:val="en_US" w:bidi="en_US"/>
@@ -2195,12 +2429,18 @@
         </w:rPr>
         <w:t xml:space="preserve"> over another person, they are </w:t>
       </w:r>
-      <w:r>
-        <w:rPr>
-          <w:lang w:val="en_US" w:bidi="en_US"/>
-        </w:rPr>
-        <w:t>praying</w:t>
-      </w:r>
+      <w:hyperlink r:id="rId55">
+        <w:r>
+          <w:rPr>
+            <w:lang w:val="en_US" w:bidi="en_US"/>
+          </w:rPr>
+          <w:rPr>
+            <w:color w:val="0000EE"/>
+            <w:u w:val="single"/>
+          </w:rPr>
+          <w:t>praying</w:t>
+        </w:r>
+      </w:hyperlink>
       <w:r>
         <w:rPr>
           <w:lang w:val="en_US" w:bidi="en_US"/>
@@ -2221,12 +2461,18 @@
         </w:rPr>
         <w:t xml:space="preserve">When people are blessing God, it means they are </w:t>
       </w:r>
-      <w:r>
-        <w:rPr>
-          <w:lang w:val="en_US" w:bidi="en_US"/>
-        </w:rPr>
-        <w:t>worshiping</w:t>
-      </w:r>
+      <w:hyperlink r:id="rId56">
+        <w:r>
+          <w:rPr>
+            <w:lang w:val="en_US" w:bidi="en_US"/>
+          </w:rPr>
+          <w:rPr>
+            <w:color w:val="0000EE"/>
+            <w:u w:val="single"/>
+          </w:rPr>
+          <w:t>worshiping</w:t>
+        </w:r>
+      </w:hyperlink>
       <w:r>
         <w:rPr>
           <w:lang w:val="en_US" w:bidi="en_US"/>
@@ -2288,29 +2534,59 @@
         </w:rPr>
         <w:t xml:space="preserve">The opposite of a blessing is a </w:t>
       </w:r>
-      <w:r>
-        <w:rPr>
-          <w:lang w:val="en_US" w:bidi="en_US"/>
-        </w:rPr>
-        <w:t>curse</w:t>
-      </w:r>
+      <w:hyperlink r:id="rId53">
+        <w:r>
+          <w:rPr>
+            <w:lang w:val="en_US" w:bidi="en_US"/>
+          </w:rPr>
+          <w:rPr>
+            <w:color w:val="0000EE"/>
+            <w:u w:val="single"/>
+          </w:rPr>
+          <w:t>curse</w:t>
+        </w:r>
+      </w:hyperlink>
       <w:r>
         <w:rPr>
           <w:lang w:val="en_US" w:bidi="en_US"/>
         </w:rPr>
         <w:t xml:space="preserve">. Through Moses, God told the </w:t>
       </w:r>
-      <w:r>
-        <w:rPr>
-          <w:lang w:val="en_US" w:bidi="en_US"/>
-        </w:rPr>
-        <w:t>Israelites</w:t>
-      </w:r>
-      <w:r>
-        <w:rPr>
-          <w:lang w:val="en_US" w:bidi="en_US"/>
-        </w:rPr>
-        <w:t xml:space="preserve"> that if they would obey God's commandments, God would bless them. But if they would disobey God, God would curse them. God will not protect those people who are cursed, and people who are cursed will not be in a good relationship with God.</w:t>
+      <w:hyperlink r:id="rId40">
+        <w:r>
+          <w:rPr>
+            <w:lang w:val="en_US" w:bidi="en_US"/>
+          </w:rPr>
+          <w:rPr>
+            <w:color w:val="0000EE"/>
+            <w:u w:val="single"/>
+          </w:rPr>
+          <w:t>Israelites</w:t>
+        </w:r>
+      </w:hyperlink>
+      <w:r>
+        <w:rPr>
+          <w:lang w:val="en_US" w:bidi="en_US"/>
+        </w:rPr>
+        <w:t xml:space="preserve"> that if they would obey God's commandments, God would bless them. But if they would disobey God, God would curse them. God will not protect those people who are cursed, and people who are cursed will not be in a good </w:t>
+      </w:r>
+      <w:hyperlink r:id="rId57">
+        <w:r>
+          <w:rPr>
+            <w:lang w:val="en_US" w:bidi="en_US"/>
+          </w:rPr>
+          <w:rPr>
+            <w:color w:val="0000EE"/>
+            <w:u w:val="single"/>
+          </w:rPr>
+          <w:t>relationship</w:t>
+        </w:r>
+      </w:hyperlink>
+      <w:r>
+        <w:rPr>
+          <w:lang w:val="en_US" w:bidi="en_US"/>
+        </w:rPr>
+        <w:t xml:space="preserve"> with God.</w:t>
       </w:r>
       <w:r>
         <w:rPr>
@@ -2370,7 +2646,7 @@
           <w:lang w:val="en_US" w:bidi="en_US"/>
         </w:rPr>
       </w:r>
-      <w:hyperlink r:id="rId21">
+      <w:hyperlink r:id="rId58">
         <w:r>
           <w:rPr>
             <w:lang w:val="en_US" w:bidi="en_US"/>
@@ -2464,24 +2740,36 @@
         </w:rPr>
         <w:t xml:space="preserve">Because blood, as long as it is in our bodies, represented life, losing blood represented death. Anything which is dead symbolizes how bad </w:t>
       </w:r>
-      <w:r>
-        <w:rPr>
-          <w:lang w:val="en_US" w:bidi="en_US"/>
-        </w:rPr>
-        <w:t>sin</w:t>
-      </w:r>
+      <w:hyperlink r:id="rId26">
+        <w:r>
+          <w:rPr>
+            <w:lang w:val="en_US" w:bidi="en_US"/>
+          </w:rPr>
+          <w:rPr>
+            <w:color w:val="0000EE"/>
+            <w:u w:val="single"/>
+          </w:rPr>
+          <w:t>sin</w:t>
+        </w:r>
+      </w:hyperlink>
       <w:r>
         <w:rPr>
           <w:lang w:val="en_US" w:bidi="en_US"/>
         </w:rPr>
         <w:t xml:space="preserve"> has made God's good creation. Therefore, a dead body of a human or an animal was </w:t>
       </w:r>
-      <w:r>
-        <w:rPr>
-          <w:lang w:val="en_US" w:bidi="en_US"/>
-        </w:rPr>
-        <w:t>unclean</w:t>
-      </w:r>
+      <w:hyperlink r:id="rId17">
+        <w:r>
+          <w:rPr>
+            <w:lang w:val="en_US" w:bidi="en_US"/>
+          </w:rPr>
+          <w:rPr>
+            <w:color w:val="0000EE"/>
+            <w:u w:val="single"/>
+          </w:rPr>
+          <w:t>unclean</w:t>
+        </w:r>
+      </w:hyperlink>
       <w:r>
         <w:rPr>
           <w:lang w:val="en_US" w:bidi="en_US"/>
@@ -2502,12 +2790,18 @@
         </w:rPr>
         <w:t xml:space="preserve">A person who was losing blood was for this reason also unclean. Even though the person was not dead, it was as if they-symbolically-were already a little bit dead. Therefore even a woman who was just menstruating, or a man who was discharging blood, was unclean until the bleeding was over. Anyone who touched such a person became unclean as well. In the </w:t>
       </w:r>
-      <w:r>
-        <w:rPr>
-          <w:lang w:val="en_US" w:bidi="en_US"/>
-        </w:rPr>
-        <w:t>Gospels</w:t>
-      </w:r>
+      <w:hyperlink r:id="rId59">
+        <w:r>
+          <w:rPr>
+            <w:lang w:val="en_US" w:bidi="en_US"/>
+          </w:rPr>
+          <w:rPr>
+            <w:color w:val="0000EE"/>
+            <w:u w:val="single"/>
+          </w:rPr>
+          <w:t>Gospels</w:t>
+        </w:r>
+      </w:hyperlink>
       <w:r>
         <w:rPr>
           <w:lang w:val="en_US" w:bidi="en_US"/>
@@ -2542,48 +2836,72 @@
         </w:rPr>
         <w:t xml:space="preserve">Even though losing blood was bad and made someone unclean, blood of animals that were sacrificed to God were used to make people or things clean. Blood was an important part of the </w:t>
       </w:r>
-      <w:r>
-        <w:rPr>
-          <w:lang w:val="en_US" w:bidi="en_US"/>
-        </w:rPr>
-        <w:t>sacrifices</w:t>
-      </w:r>
+      <w:hyperlink r:id="rId60">
+        <w:r>
+          <w:rPr>
+            <w:lang w:val="en_US" w:bidi="en_US"/>
+          </w:rPr>
+          <w:rPr>
+            <w:color w:val="0000EE"/>
+            <w:u w:val="single"/>
+          </w:rPr>
+          <w:t>sacrifices</w:t>
+        </w:r>
+      </w:hyperlink>
       <w:r>
         <w:rPr>
           <w:lang w:val="en_US" w:bidi="en_US"/>
         </w:rPr>
         <w:t xml:space="preserve"> that the </w:t>
       </w:r>
-      <w:r>
-        <w:rPr>
-          <w:lang w:val="en_US" w:bidi="en_US"/>
-        </w:rPr>
-        <w:t>Israelites</w:t>
-      </w:r>
+      <w:hyperlink r:id="rId40">
+        <w:r>
+          <w:rPr>
+            <w:lang w:val="en_US" w:bidi="en_US"/>
+          </w:rPr>
+          <w:rPr>
+            <w:color w:val="0000EE"/>
+            <w:u w:val="single"/>
+          </w:rPr>
+          <w:t>Israelites</w:t>
+        </w:r>
+      </w:hyperlink>
       <w:r>
         <w:rPr>
           <w:lang w:val="en_US" w:bidi="en_US"/>
         </w:rPr>
         <w:t xml:space="preserve"> made to God. When the </w:t>
       </w:r>
-      <w:r>
-        <w:rPr>
-          <w:lang w:val="en_US" w:bidi="en_US"/>
-        </w:rPr>
-        <w:t>priests</w:t>
-      </w:r>
+      <w:hyperlink r:id="rId15">
+        <w:r>
+          <w:rPr>
+            <w:lang w:val="en_US" w:bidi="en_US"/>
+          </w:rPr>
+          <w:rPr>
+            <w:color w:val="0000EE"/>
+            <w:u w:val="single"/>
+          </w:rPr>
+          <w:t>priests</w:t>
+        </w:r>
+      </w:hyperlink>
       <w:r>
         <w:rPr>
           <w:lang w:val="en_US" w:bidi="en_US"/>
         </w:rPr>
         <w:t xml:space="preserve"> brought God a sacrifice, they collected the blood of the animal that they were sacrificing. Depending on the type of ritual, the priests would sprinkle the blood on the </w:t>
       </w:r>
-      <w:r>
-        <w:rPr>
-          <w:lang w:val="en_US" w:bidi="en_US"/>
-        </w:rPr>
-        <w:t>altar</w:t>
-      </w:r>
+      <w:hyperlink r:id="rId61">
+        <w:r>
+          <w:rPr>
+            <w:lang w:val="en_US" w:bidi="en_US"/>
+          </w:rPr>
+          <w:rPr>
+            <w:color w:val="0000EE"/>
+            <w:u w:val="single"/>
+          </w:rPr>
+          <w:t>altar</w:t>
+        </w:r>
+      </w:hyperlink>
       <w:r>
         <w:rPr>
           <w:lang w:val="en_US" w:bidi="en_US"/>
@@ -2604,48 +2922,72 @@
         </w:rPr>
         <w:t xml:space="preserve">Blood was also used to make a formal agreement, called a </w:t>
       </w:r>
-      <w:r>
-        <w:rPr>
-          <w:lang w:val="en_US" w:bidi="en_US"/>
-        </w:rPr>
-        <w:t>covenant</w:t>
-      </w:r>
+      <w:hyperlink r:id="rId62">
+        <w:r>
+          <w:rPr>
+            <w:lang w:val="en_US" w:bidi="en_US"/>
+          </w:rPr>
+          <w:rPr>
+            <w:color w:val="0000EE"/>
+            <w:u w:val="single"/>
+          </w:rPr>
+          <w:t>covenant</w:t>
+        </w:r>
+      </w:hyperlink>
       <w:r>
         <w:rPr>
           <w:lang w:val="en_US" w:bidi="en_US"/>
         </w:rPr>
         <w:t xml:space="preserve">. When God made his covenant with </w:t>
       </w:r>
-      <w:r>
-        <w:rPr>
-          <w:lang w:val="en_US" w:bidi="en_US"/>
-        </w:rPr>
-        <w:t>Abraham</w:t>
-      </w:r>
+      <w:hyperlink r:id="rId32">
+        <w:r>
+          <w:rPr>
+            <w:lang w:val="en_US" w:bidi="en_US"/>
+          </w:rPr>
+          <w:rPr>
+            <w:color w:val="0000EE"/>
+            <w:u w:val="single"/>
+          </w:rPr>
+          <w:t>Abraham</w:t>
+        </w:r>
+      </w:hyperlink>
       <w:r>
         <w:rPr>
           <w:lang w:val="en_US" w:bidi="en_US"/>
         </w:rPr>
         <w:t xml:space="preserve">, Abraham had to kill some animals, and therefore he shed blood. Jesus says that his, Jesus', blood is the sign of the new covenant. This means that the death of Jesus made possible a new covenant between God and people. In the Old Testament, the blood of animals made people clean. But now the blood of Jesus makes the people who </w:t>
       </w:r>
-      <w:r>
-        <w:rPr>
-          <w:lang w:val="en_US" w:bidi="en_US"/>
-        </w:rPr>
-        <w:t>believe</w:t>
-      </w:r>
+      <w:hyperlink r:id="rId24">
+        <w:r>
+          <w:rPr>
+            <w:lang w:val="en_US" w:bidi="en_US"/>
+          </w:rPr>
+          <w:rPr>
+            <w:color w:val="0000EE"/>
+            <w:u w:val="single"/>
+          </w:rPr>
+          <w:t>believe</w:t>
+        </w:r>
+      </w:hyperlink>
       <w:r>
         <w:rPr>
           <w:lang w:val="en_US" w:bidi="en_US"/>
         </w:rPr>
         <w:t xml:space="preserve"> in him clean-God </w:t>
       </w:r>
-      <w:r>
-        <w:rPr>
-          <w:lang w:val="en_US" w:bidi="en_US"/>
-        </w:rPr>
-        <w:t>forgives</w:t>
-      </w:r>
+      <w:hyperlink r:id="rId25">
+        <w:r>
+          <w:rPr>
+            <w:lang w:val="en_US" w:bidi="en_US"/>
+          </w:rPr>
+          <w:rPr>
+            <w:color w:val="0000EE"/>
+            <w:u w:val="single"/>
+          </w:rPr>
+          <w:t>forgives</w:t>
+        </w:r>
+      </w:hyperlink>
       <w:r>
         <w:rPr>
           <w:lang w:val="en_US" w:bidi="en_US"/>
@@ -2710,7 +3052,7 @@
           <w:lang w:val="en_US" w:bidi="en_US"/>
         </w:rPr>
       </w:r>
-      <w:hyperlink r:id="rId22">
+      <w:hyperlink r:id="rId63">
         <w:r>
           <w:rPr>
             <w:lang w:val="en_US" w:bidi="en_US"/>
@@ -2817,24 +3159,36 @@
         </w:rPr>
         <w:t xml:space="preserve">Jesus and his </w:t>
       </w:r>
-      <w:r>
-        <w:rPr>
-          <w:lang w:val="en_US" w:bidi="en_US"/>
-        </w:rPr>
-        <w:t>disciples</w:t>
-      </w:r>
+      <w:hyperlink r:id="rId21">
+        <w:r>
+          <w:rPr>
+            <w:lang w:val="en_US" w:bidi="en_US"/>
+          </w:rPr>
+          <w:rPr>
+            <w:color w:val="0000EE"/>
+            <w:u w:val="single"/>
+          </w:rPr>
+          <w:t>disciples</w:t>
+        </w:r>
+      </w:hyperlink>
       <w:r>
         <w:rPr>
           <w:lang w:val="en_US" w:bidi="en_US"/>
         </w:rPr>
         <w:t xml:space="preserve"> often traveled by boat across the </w:t>
       </w:r>
-      <w:r>
-        <w:rPr>
-          <w:lang w:val="en_US" w:bidi="en_US"/>
-        </w:rPr>
-        <w:t>Sea of Galilee</w:t>
-      </w:r>
+      <w:hyperlink r:id="rId50">
+        <w:r>
+          <w:rPr>
+            <w:lang w:val="en_US" w:bidi="en_US"/>
+          </w:rPr>
+          <w:rPr>
+            <w:color w:val="0000EE"/>
+            <w:u w:val="single"/>
+          </w:rPr>
+          <w:t>Sea of Galilee</w:t>
+        </w:r>
+      </w:hyperlink>
       <w:r>
         <w:rPr>
           <w:lang w:val="en_US" w:bidi="en_US"/>
@@ -2869,12 +3223,18 @@
         </w:rPr>
         <w:t xml:space="preserve">A boat has a small, movable, piece of wood attached to it which is called a rudder. This allows the people to make the boat go in the direction that they want. </w:t>
       </w:r>
-      <w:r>
-        <w:rPr>
-          <w:lang w:val="en_US" w:bidi="en_US"/>
-        </w:rPr>
-        <w:t>James</w:t>
-      </w:r>
+      <w:hyperlink r:id="rId64">
+        <w:r>
+          <w:rPr>
+            <w:lang w:val="en_US" w:bidi="en_US"/>
+          </w:rPr>
+          <w:rPr>
+            <w:color w:val="0000EE"/>
+            <w:u w:val="single"/>
+          </w:rPr>
+          <w:t>James</w:t>
+        </w:r>
+      </w:hyperlink>
       <w:r>
         <w:rPr>
           <w:lang w:val="en_US" w:bidi="en_US"/>
@@ -2967,7 +3327,7 @@
           <w:lang w:val="en_US" w:bidi="en_US"/>
         </w:rPr>
       </w:r>
-      <w:hyperlink r:id="rId23">
+      <w:hyperlink r:id="rId65">
         <w:r>
           <w:rPr>
             <w:lang w:val="en_US" w:bidi="en_US"/>
@@ -3118,7 +3478,7 @@
           <w:lang w:val="en_US" w:bidi="en_US"/>
         </w:rPr>
       </w:r>
-      <w:hyperlink r:id="rId24">
+      <w:hyperlink r:id="rId66">
         <w:r>
           <w:rPr>
             <w:lang w:val="en_US" w:bidi="en_US"/>
@@ -3197,36 +3557,54 @@
         </w:rPr>
         <w:t xml:space="preserve"> was 12 loaves of bread that priests put on the table in the Holy Place of the </w:t>
       </w:r>
-      <w:r>
-        <w:rPr>
-          <w:lang w:val="en_US" w:bidi="en_US"/>
-        </w:rPr>
-        <w:t>tabernacle</w:t>
-      </w:r>
+      <w:hyperlink r:id="rId67">
+        <w:r>
+          <w:rPr>
+            <w:lang w:val="en_US" w:bidi="en_US"/>
+          </w:rPr>
+          <w:rPr>
+            <w:color w:val="0000EE"/>
+            <w:u w:val="single"/>
+          </w:rPr>
+          <w:t>tabernacle</w:t>
+        </w:r>
+      </w:hyperlink>
       <w:r>
         <w:rPr>
           <w:lang w:val="en_US" w:bidi="en_US"/>
         </w:rPr>
         <w:t xml:space="preserve">, and later, in the </w:t>
       </w:r>
-      <w:r>
-        <w:rPr>
-          <w:lang w:val="en_US" w:bidi="en_US"/>
-        </w:rPr>
-        <w:t>temple</w:t>
-      </w:r>
+      <w:hyperlink r:id="rId16">
+        <w:r>
+          <w:rPr>
+            <w:lang w:val="en_US" w:bidi="en_US"/>
+          </w:rPr>
+          <w:rPr>
+            <w:color w:val="0000EE"/>
+            <w:u w:val="single"/>
+          </w:rPr>
+          <w:t>temple</w:t>
+        </w:r>
+      </w:hyperlink>
       <w:r>
         <w:rPr>
           <w:lang w:val="en_US" w:bidi="en_US"/>
         </w:rPr>
         <w:t xml:space="preserve"> of Yahweh. Every Sabbath, the </w:t>
       </w:r>
-      <w:r>
-        <w:rPr>
-          <w:lang w:val="en_US" w:bidi="en_US"/>
-        </w:rPr>
-        <w:t>priests</w:t>
-      </w:r>
+      <w:hyperlink r:id="rId15">
+        <w:r>
+          <w:rPr>
+            <w:lang w:val="en_US" w:bidi="en_US"/>
+          </w:rPr>
+          <w:rPr>
+            <w:color w:val="0000EE"/>
+            <w:u w:val="single"/>
+          </w:rPr>
+          <w:t>priests</w:t>
+        </w:r>
+      </w:hyperlink>
       <w:r>
         <w:rPr>
           <w:lang w:val="en_US" w:bidi="en_US"/>
@@ -3333,7 +3711,7 @@
           <w:lang w:val="en_US" w:bidi="en_US"/>
         </w:rPr>
       </w:r>
-      <w:hyperlink r:id="rId25">
+      <w:hyperlink r:id="rId68">
         <w:r>
           <w:rPr>
             <w:lang w:val="en_US" w:bidi="en_US"/>
@@ -3406,24 +3784,36 @@
         </w:rPr>
         <w:t xml:space="preserve"> is a metal that people make when they heat copper and tin in a very hot fire until the two metals become a liquid and melt together. When this new metal cools, it is very hard and tough. So people would use bronze to make important items like some of the special cups, bowls, and forks for the </w:t>
       </w:r>
-      <w:r>
-        <w:rPr>
-          <w:lang w:val="en_US" w:bidi="en_US"/>
-        </w:rPr>
-        <w:t>tabernacle</w:t>
-      </w:r>
+      <w:hyperlink r:id="rId67">
+        <w:r>
+          <w:rPr>
+            <w:lang w:val="en_US" w:bidi="en_US"/>
+          </w:rPr>
+          <w:rPr>
+            <w:color w:val="0000EE"/>
+            <w:u w:val="single"/>
+          </w:rPr>
+          <w:t>tabernacle</w:t>
+        </w:r>
+      </w:hyperlink>
       <w:r>
         <w:rPr>
           <w:lang w:val="en_US" w:bidi="en_US"/>
         </w:rPr>
         <w:t xml:space="preserve"> and </w:t>
       </w:r>
-      <w:r>
-        <w:rPr>
-          <w:lang w:val="en_US" w:bidi="en_US"/>
-        </w:rPr>
-        <w:t>temple</w:t>
-      </w:r>
+      <w:hyperlink r:id="rId16">
+        <w:r>
+          <w:rPr>
+            <w:lang w:val="en_US" w:bidi="en_US"/>
+          </w:rPr>
+          <w:rPr>
+            <w:color w:val="0000EE"/>
+            <w:u w:val="single"/>
+          </w:rPr>
+          <w:t>temple</w:t>
+        </w:r>
+      </w:hyperlink>
       <w:r>
         <w:rPr>
           <w:lang w:val="en_US" w:bidi="en_US"/>
@@ -3502,7 +3892,7 @@
           <w:lang w:val="en_US" w:bidi="en_US"/>
         </w:rPr>
       </w:r>
-      <w:hyperlink r:id="rId26">
+      <w:hyperlink r:id="rId69">
         <w:r>
           <w:rPr>
             <w:lang w:val="en_US" w:bidi="en_US"/>
@@ -3581,24 +3971,36 @@
         </w:rPr>
         <w:t xml:space="preserve"> is a form of </w:t>
       </w:r>
-      <w:r>
-        <w:rPr>
-          <w:lang w:val="en_US" w:bidi="en_US"/>
-        </w:rPr>
-        <w:t>sacrifice</w:t>
-      </w:r>
+      <w:hyperlink r:id="rId60">
+        <w:r>
+          <w:rPr>
+            <w:lang w:val="en_US" w:bidi="en_US"/>
+          </w:rPr>
+          <w:rPr>
+            <w:color w:val="0000EE"/>
+            <w:u w:val="single"/>
+          </w:rPr>
+          <w:t>sacrifice</w:t>
+        </w:r>
+      </w:hyperlink>
       <w:r>
         <w:rPr>
           <w:lang w:val="en_US" w:bidi="en_US"/>
         </w:rPr>
         <w:t xml:space="preserve"> that people bring to God. When a person brings God a burnt offering, he kills an animal and burns this animal completely on an </w:t>
       </w:r>
-      <w:r>
-        <w:rPr>
-          <w:lang w:val="en_US" w:bidi="en_US"/>
-        </w:rPr>
-        <w:t>altar</w:t>
-      </w:r>
+      <w:hyperlink r:id="rId61">
+        <w:r>
+          <w:rPr>
+            <w:lang w:val="en_US" w:bidi="en_US"/>
+          </w:rPr>
+          <w:rPr>
+            <w:color w:val="0000EE"/>
+            <w:u w:val="single"/>
+          </w:rPr>
+          <w:t>altar</w:t>
+        </w:r>
+      </w:hyperlink>
       <w:r>
         <w:rPr>
           <w:lang w:val="en_US" w:bidi="en_US"/>
@@ -3663,7 +4065,7 @@
           <w:lang w:val="en_US" w:bidi="en_US"/>
         </w:rPr>
       </w:r>
-      <w:hyperlink r:id="rId27">
+      <w:hyperlink r:id="rId70">
         <w:r>
           <w:rPr>
             <w:lang w:val="en_US" w:bidi="en_US"/>

</xml_diff>